<commit_message>
Added final updates to both the markdown version of the technical report as well as the microsoft word version
</commit_message>
<xml_diff>
--- a/docs/Pharmacy_Inventory_Management_System_Technical_Report.docx
+++ b/docs/Pharmacy_Inventory_Management_System_Technical_Report.docx
@@ -123,6 +123,64 @@
               </w:rPr>
               <w:t>Frank Akrasi Antwi</w:t>
             </w:r>
+          </w:p>
+        </w:tc>
+      </w:tr>
+      <w:tr>
+        <w:tblPrEx>
+          <w:tblCellMar>
+            <w:top w:w="0" w:type="dxa"/>
+            <w:left w:w="108" w:type="dxa"/>
+            <w:bottom w:w="0" w:type="dxa"/>
+            <w:right w:w="108" w:type="dxa"/>
+          </w:tblCellMar>
+        </w:tblPrEx>
+        <w:trPr>
+          <w:jc w:val="center"/>
+        </w:trPr>
+        <w:tc>
+          <w:tcPr>
+            <w:tcW w:w="4968" w:type="dxa"/>
+            <w:shd w:val="clear" w:color="auto" w:fill="EAF2F8"/>
+            <w:vAlign w:val="center"/>
+          </w:tcPr>
+          <w:p>
+            <w:pPr>
+              <w:rPr>
+                <w:rFonts w:hint="default"/>
+                <w:lang w:val="en-US"/>
+              </w:rPr>
+            </w:pPr>
+            <w:r>
+              <w:rPr>
+                <w:rFonts w:hint="default"/>
+                <w:lang w:val="en-US"/>
+              </w:rPr>
+              <w:t>Index Number</w:t>
+            </w:r>
+          </w:p>
+        </w:tc>
+        <w:tc>
+          <w:tcPr>
+            <w:tcW w:w="4968" w:type="dxa"/>
+            <w:vAlign w:val="center"/>
+          </w:tcPr>
+          <w:p>
+            <w:pPr>
+              <w:rPr>
+                <w:rFonts w:hint="default"/>
+                <w:lang w:val="en-US"/>
+              </w:rPr>
+            </w:pPr>
+            <w:r>
+              <w:rPr>
+                <w:rFonts w:hint="default"/>
+                <w:lang w:val="en-US"/>
+              </w:rPr>
+              <w:t>MS/ITE/25/0051</w:t>
+            </w:r>
+            <w:bookmarkStart w:id="0" w:name="_GoBack"/>
+            <w:bookmarkEnd w:id="0"/>
           </w:p>
         </w:tc>
       </w:tr>
@@ -846,8 +904,6 @@
         </w:rPr>
         <w:fldChar w:fldCharType="end"/>
       </w:r>
-      <w:bookmarkStart w:id="0" w:name="_GoBack"/>
-      <w:bookmarkEnd w:id="0"/>
     </w:p>
     <w:p>
       <w:pPr>

</xml_diff>